<commit_message>
submission: add homework and final deliverables
</commit_message>
<xml_diff>
--- a/DM2026-Lab1-Master-Questions.docx
+++ b/DM2026-Lab1-Master-Questions.docx
@@ -2956,6 +2956,9 @@
                 <w:rFonts w:ascii="Century Schoolbook" w:hAnsi="Century Schoolbook"/>
               </w:rPr>
             </w:pPr>
+            <w:r>
+              <w:t>35482</w:t>
+            </w:r>
           </w:p>
         </w:tc>
       </w:tr>
@@ -2997,6 +3000,9 @@
                 <w:rFonts w:ascii="Century Schoolbook" w:hAnsi="Century Schoolbook"/>
               </w:rPr>
             </w:pPr>
+            <w:r>
+              <w:t>5089</w:t>
+            </w:r>
           </w:p>
         </w:tc>
       </w:tr>
@@ -3038,6 +3044,9 @@
                 <w:rFonts w:ascii="Century Schoolbook" w:hAnsi="Century Schoolbook"/>
               </w:rPr>
             </w:pPr>
+            <w:r>
+              <w:t>1491</w:t>
+            </w:r>
           </w:p>
         </w:tc>
       </w:tr>

</xml_diff>